<commit_message>
++++ML_VIDEO++++:Thresold,margins,types of kernel functions in SVM and ML book
</commit_message>
<xml_diff>
--- a/machine_learning_basics/SVM.docx
+++ b/machine_learning_basics/SVM.docx
@@ -3,6 +3,112 @@
 <w:document xmlns:wpc="http://schemas.microsoft.com/office/word/2010/wordprocessingCanvas" xmlns:cx="http://schemas.microsoft.com/office/drawing/2014/chartex" xmlns:cx1="http://schemas.microsoft.com/office/drawing/2015/9/8/chartex" xmlns:cx2="http://schemas.microsoft.com/office/drawing/2015/10/21/chartex" xmlns:cx3="http://schemas.microsoft.com/office/drawing/2016/5/9/chartex" xmlns:cx4="http://schemas.microsoft.com/office/drawing/2016/5/10/chartex" xmlns:cx5="http://schemas.microsoft.com/office/drawing/2016/5/11/chartex" xmlns:cx6="http://schemas.microsoft.com/office/drawing/2016/5/12/chartex" xmlns:cx7="http://schemas.microsoft.com/office/drawing/2016/5/13/chartex" xmlns:cx8="http://schemas.microsoft.com/office/drawing/2016/5/14/chartex" xmlns:mc="http://schemas.openxmlformats.org/markup-compatibility/2006" xmlns:aink="http://schemas.microsoft.com/office/drawing/2016/ink" xmlns:am3d="http://schemas.microsoft.com/office/drawing/2017/model3d" xmlns:o="urn:schemas-microsoft-com:office:office" xmlns:oel="http://schemas.microsoft.com/office/2019/extlst" xmlns:r="http://schemas.openxmlformats.org/officeDocument/2006/relationships" xmlns:m="http://schemas.openxmlformats.org/officeDocument/2006/math" xmlns:v="urn:schemas-microsoft-com:vml" xmlns:wp14="http://schemas.microsoft.com/office/word/2010/wordprocessingDrawing" xmlns:wp="http://schemas.openxmlformats.org/drawingml/2006/wordprocessingDrawing" xmlns:w10="urn:schemas-microsoft-com:office:word" xmlns:w="http://schemas.openxmlformats.org/wordprocessingml/2006/main" xmlns:w14="http://schemas.microsoft.com/office/word/2010/wordml" xmlns:w15="http://schemas.microsoft.com/office/word/2012/wordml" xmlns:w16cex="http://schemas.microsoft.com/office/word/2018/wordml/cex" xmlns:w16cid="http://schemas.microsoft.com/office/word/2016/wordml/cid" xmlns:w16="http://schemas.microsoft.com/office/word/2018/wordml" xmlns:w16du="http://schemas.microsoft.com/office/word/2023/wordml/word16du" xmlns:w16sdtdh="http://schemas.microsoft.com/office/word/2020/wordml/sdtdatahash" xmlns:w16sdtfl="http://schemas.microsoft.com/office/word/2024/wordml/sdtformatlock" xmlns:w16se="http://schemas.microsoft.com/office/word/2015/wordml/symex" xmlns:wpg="http://schemas.microsoft.com/office/word/2010/wordprocessingGroup" xmlns:wpi="http://schemas.microsoft.com/office/word/2010/wordprocessingInk" xmlns:wne="http://schemas.microsoft.com/office/word/2006/wordml" xmlns:wps="http://schemas.microsoft.com/office/word/2010/wordprocessingShape" mc:Ignorable="w14 w15 w16se w16cid w16 w16cex w16sdtdh w16sdtfl w16du wp14">
   <w:body>
     <w:p>
+      <w:pPr>
+        <w:rPr>
+          <w:b/>
+          <w:bCs/>
+          <w:sz w:val="28"/>
+          <w:szCs w:val="28"/>
+        </w:rPr>
+      </w:pPr>
+      <w:r>
+        <w:rPr>
+          <w:b/>
+          <w:bCs/>
+          <w:sz w:val="28"/>
+          <w:szCs w:val="28"/>
+        </w:rPr>
+        <w:t>WHAT IS SUPPORT VECTOR?</w:t>
+      </w:r>
+    </w:p>
+    <w:p>
+      <w:r>
+        <w:t>A true instance of a class are called support vector</w:t>
+      </w:r>
+    </w:p>
+    <w:p>
+      <w:r>
+        <w:drawing>
+          <wp:inline distT="0" distB="0" distL="0" distR="0" wp14:anchorId="7C93F533" wp14:editId="52A63FA3">
+            <wp:extent cx="2001982" cy="916975"/>
+            <wp:effectExtent l="0" t="0" r="0" b="0"/>
+            <wp:docPr id="1834042066" name="Picture 1"/>
+            <wp:cNvGraphicFramePr>
+              <a:graphicFrameLocks xmlns:a="http://schemas.openxmlformats.org/drawingml/2006/main" noChangeAspect="1"/>
+            </wp:cNvGraphicFramePr>
+            <a:graphic xmlns:a="http://schemas.openxmlformats.org/drawingml/2006/main">
+              <a:graphicData uri="http://schemas.openxmlformats.org/drawingml/2006/picture">
+                <pic:pic xmlns:pic="http://schemas.openxmlformats.org/drawingml/2006/picture">
+                  <pic:nvPicPr>
+                    <pic:cNvPr id="1834042066" name=""/>
+                    <pic:cNvPicPr/>
+                  </pic:nvPicPr>
+                  <pic:blipFill>
+                    <a:blip r:embed="rId5"/>
+                    <a:stretch>
+                      <a:fillRect/>
+                    </a:stretch>
+                  </pic:blipFill>
+                  <pic:spPr>
+                    <a:xfrm>
+                      <a:off x="0" y="0"/>
+                      <a:ext cx="2011794" cy="921469"/>
+                    </a:xfrm>
+                    <a:prstGeom prst="rect">
+                      <a:avLst/>
+                    </a:prstGeom>
+                  </pic:spPr>
+                </pic:pic>
+              </a:graphicData>
+            </a:graphic>
+          </wp:inline>
+        </w:drawing>
+      </w:r>
+    </w:p>
+    <w:p>
+      <w:pPr>
+        <w:rPr>
+          <w:b/>
+          <w:bCs/>
+          <w:sz w:val="28"/>
+          <w:szCs w:val="28"/>
+        </w:rPr>
+      </w:pPr>
+      <w:r>
+        <w:rPr>
+          <w:b/>
+          <w:bCs/>
+          <w:sz w:val="28"/>
+          <w:szCs w:val="28"/>
+        </w:rPr>
+        <w:t>WHAT IS SVC?</w:t>
+      </w:r>
+    </w:p>
+    <w:p>
+      <w:r>
+        <w:t>Support vector classifier will have a problem to select threshold(centre point of the data)</w:t>
+      </w:r>
+    </w:p>
+    <w:p>
+      <w:pPr>
+        <w:rPr>
+          <w:b/>
+          <w:bCs/>
+          <w:sz w:val="28"/>
+          <w:szCs w:val="28"/>
+        </w:rPr>
+      </w:pPr>
+      <w:r>
+        <w:rPr>
+          <w:b/>
+          <w:bCs/>
+          <w:sz w:val="28"/>
+          <w:szCs w:val="28"/>
+        </w:rPr>
+        <w:t>WHAT IS SVM</w:t>
+      </w:r>
+    </w:p>
+    <w:p>
       <w:r>
         <w:t xml:space="preserve">Support Vector Machine (SVM) is a machine learning model that classifies data by finding the best dividing line (called a </w:t>
       </w:r>
@@ -14,7 +120,12 @@
         <w:t>hyperplane</w:t>
       </w:r>
       <w:r>
-        <w:t xml:space="preserve">) between different categories. If the data cannot be separated in its original form (low dimension), SVM uses </w:t>
+        <w:t>) between different categories.</w:t>
+      </w:r>
+    </w:p>
+    <w:p>
+      <w:r>
+        <w:t xml:space="preserve">If the data cannot be separated in its original form (low dimension), SVM uses </w:t>
       </w:r>
       <w:r>
         <w:rPr>
@@ -46,300 +157,355 @@
       </w:pPr>
       <w:r>
         <w:rPr>
-          <w:rFonts w:ascii="Segoe UI Emoji" w:hAnsi="Segoe UI Emoji" w:cs="Segoe UI Emoji"/>
-          <w:b/>
-          <w:bCs/>
-        </w:rPr>
-        <w:t>🤖</w:t>
-      </w:r>
-      <w:r>
-        <w:rPr>
-          <w:b/>
-          <w:bCs/>
-        </w:rPr>
-        <w:t xml:space="preserve"> SVM Explained Simply (with Example):</w:t>
-      </w:r>
-    </w:p>
-    <w:p>
-      <w:r>
-        <w:t xml:space="preserve">Imagine you're trying to separate </w:t>
-      </w:r>
-      <w:r>
-        <w:rPr>
-          <w:b/>
-          <w:bCs/>
-        </w:rPr>
-        <w:t>red apples</w:t>
-      </w:r>
-      <w:r>
-        <w:t xml:space="preserve"> and </w:t>
-      </w:r>
-      <w:r>
-        <w:rPr>
-          <w:b/>
-          <w:bCs/>
-        </w:rPr>
-        <w:t>green apples</w:t>
-      </w:r>
-      <w:r>
-        <w:t xml:space="preserve"> on a table using a straight stick.</w:t>
-      </w:r>
-      <w:r>
-        <w:br/>
-        <w:t>If they are mixed up in a way that you can't separate them with a straight line, what do you do?</w:t>
-      </w:r>
-    </w:p>
-    <w:p>
-      <w:r>
-        <w:rPr>
-          <w:rFonts w:ascii="Segoe UI Emoji" w:hAnsi="Segoe UI Emoji" w:cs="Segoe UI Emoji"/>
-        </w:rPr>
-        <w:t>💡</w:t>
+          <w:b/>
+          <w:bCs/>
+        </w:rPr>
+        <w:t>EX</w:t>
+      </w:r>
+      <w:r>
+        <w:rPr>
+          <w:b/>
+          <w:bCs/>
+        </w:rPr>
+        <w:t>:</w:t>
+      </w:r>
+    </w:p>
+    <w:p>
+      <w:r>
+        <w:t xml:space="preserve">In below example the 1D data are transformed to 2D </w:t>
+      </w:r>
+      <w:r>
+        <w:t xml:space="preserve">or 3D or 4D </w:t>
+      </w:r>
+      <w:r>
+        <w:t xml:space="preserve">to make </w:t>
+      </w:r>
+      <w:r>
+        <w:t>separable</w:t>
+      </w:r>
+      <w:r>
+        <w:t xml:space="preserve"> with the help of kernel functions</w:t>
+      </w:r>
+      <w:r>
+        <w:t>.</w:t>
+      </w:r>
+    </w:p>
+    <w:p>
+      <w:r>
+        <w:drawing>
+          <wp:inline distT="0" distB="0" distL="0" distR="0" wp14:anchorId="2D51626D" wp14:editId="33C69CDD">
+            <wp:extent cx="2632364" cy="1537183"/>
+            <wp:effectExtent l="0" t="0" r="0" b="6350"/>
+            <wp:docPr id="1017793013" name="Picture 1"/>
+            <wp:cNvGraphicFramePr>
+              <a:graphicFrameLocks xmlns:a="http://schemas.openxmlformats.org/drawingml/2006/main" noChangeAspect="1"/>
+            </wp:cNvGraphicFramePr>
+            <a:graphic xmlns:a="http://schemas.openxmlformats.org/drawingml/2006/main">
+              <a:graphicData uri="http://schemas.openxmlformats.org/drawingml/2006/picture">
+                <pic:pic xmlns:pic="http://schemas.openxmlformats.org/drawingml/2006/picture">
+                  <pic:nvPicPr>
+                    <pic:cNvPr id="1017793013" name=""/>
+                    <pic:cNvPicPr/>
+                  </pic:nvPicPr>
+                  <pic:blipFill>
+                    <a:blip r:embed="rId6"/>
+                    <a:stretch>
+                      <a:fillRect/>
+                    </a:stretch>
+                  </pic:blipFill>
+                  <pic:spPr>
+                    <a:xfrm>
+                      <a:off x="0" y="0"/>
+                      <a:ext cx="2642452" cy="1543074"/>
+                    </a:xfrm>
+                    <a:prstGeom prst="rect">
+                      <a:avLst/>
+                    </a:prstGeom>
+                  </pic:spPr>
+                </pic:pic>
+              </a:graphicData>
+            </a:graphic>
+          </wp:inline>
+        </w:drawing>
+      </w:r>
+    </w:p>
+    <w:p>
+      <w:r>
+        <w:t xml:space="preserve">The line which separates the red and green are also called </w:t>
+      </w:r>
+      <w:r>
+        <w:rPr>
+          <w:b/>
+          <w:bCs/>
+        </w:rPr>
+        <w:t xml:space="preserve">threshold </w:t>
+      </w:r>
+      <w:r>
+        <w:t>value for 1D vector it is called as point for From 2d it is also called ad threshold or hyperplane.</w:t>
+      </w:r>
+      <w:r>
+        <w:t xml:space="preserve"> And a point near to the threshold are called </w:t>
+      </w:r>
+      <w:r>
+        <w:rPr>
+          <w:b/>
+          <w:bCs/>
+        </w:rPr>
+        <w:t>margins</w:t>
+      </w:r>
+    </w:p>
+    <w:p>
+      <w:pPr>
+        <w:rPr>
+          <w:b/>
+          <w:bCs/>
+        </w:rPr>
+      </w:pPr>
+      <w:r>
+        <w:rPr>
+          <w:b/>
+          <w:bCs/>
+        </w:rPr>
+        <w:t>EX:</w:t>
+      </w:r>
+    </w:p>
+    <w:p>
+      <w:r>
+        <w:t xml:space="preserve">Below image is for </w:t>
+      </w:r>
+      <w:r>
+        <w:t>threshold</w:t>
+      </w:r>
+      <w:r>
+        <w:t xml:space="preserve"> point for binary 1D classification</w:t>
+      </w:r>
+    </w:p>
+    <w:p>
+      <w:r>
+        <w:drawing>
+          <wp:inline distT="0" distB="0" distL="0" distR="0" wp14:anchorId="1F8596A4" wp14:editId="62F0E4BF">
+            <wp:extent cx="3254022" cy="1044030"/>
+            <wp:effectExtent l="0" t="0" r="3810" b="3810"/>
+            <wp:docPr id="1121011670" name="Picture 1"/>
+            <wp:cNvGraphicFramePr>
+              <a:graphicFrameLocks xmlns:a="http://schemas.openxmlformats.org/drawingml/2006/main" noChangeAspect="1"/>
+            </wp:cNvGraphicFramePr>
+            <a:graphic xmlns:a="http://schemas.openxmlformats.org/drawingml/2006/main">
+              <a:graphicData uri="http://schemas.openxmlformats.org/drawingml/2006/picture">
+                <pic:pic xmlns:pic="http://schemas.openxmlformats.org/drawingml/2006/picture">
+                  <pic:nvPicPr>
+                    <pic:cNvPr id="1539997240" name=""/>
+                    <pic:cNvPicPr/>
+                  </pic:nvPicPr>
+                  <pic:blipFill>
+                    <a:blip r:embed="rId7"/>
+                    <a:stretch>
+                      <a:fillRect/>
+                    </a:stretch>
+                  </pic:blipFill>
+                  <pic:spPr>
+                    <a:xfrm>
+                      <a:off x="0" y="0"/>
+                      <a:ext cx="3254022" cy="1044030"/>
+                    </a:xfrm>
+                    <a:prstGeom prst="rect">
+                      <a:avLst/>
+                    </a:prstGeom>
+                  </pic:spPr>
+                </pic:pic>
+              </a:graphicData>
+            </a:graphic>
+          </wp:inline>
+        </w:drawing>
       </w:r>
       <w:r>
         <w:t xml:space="preserve"> </w:t>
       </w:r>
-      <w:r>
-        <w:rPr>
-          <w:b/>
-          <w:bCs/>
-        </w:rPr>
-        <w:t>SVM's Trick:</w:t>
-      </w:r>
-      <w:r>
-        <w:br/>
-        <w:t>SVM lifts the table into a 3D space (higher dimension), so now you can place a flat sheet (like a plane) to perfectly separate red apples from green apples.</w:t>
-      </w:r>
-    </w:p>
-    <w:p>
-      <w:r>
-        <w:t xml:space="preserve">This is done using </w:t>
-      </w:r>
-      <w:r>
-        <w:rPr>
-          <w:b/>
-          <w:bCs/>
-        </w:rPr>
-        <w:t>kernels</w:t>
-      </w:r>
-      <w:r>
-        <w:t xml:space="preserve"> like:</w:t>
-      </w:r>
-    </w:p>
-    <w:p>
-      <w:pPr>
+    </w:p>
+    <w:p>
+      <w:r>
+        <w:t>There will be more hyperplane used for multi dim vector</w:t>
+      </w:r>
+    </w:p>
+    <w:p>
+      <w:pPr>
+        <w:rPr>
+          <w:b/>
+          <w:bCs/>
+        </w:rPr>
+      </w:pPr>
+      <w:r>
+        <w:rPr>
+          <w:b/>
+          <w:bCs/>
+        </w:rPr>
+        <w:lastRenderedPageBreak/>
+        <w:t>EX:</w:t>
+      </w:r>
+    </w:p>
+    <w:p>
+      <w:r>
+        <w:rPr>
+          <w:b/>
+          <w:bCs/>
+          <w:sz w:val="28"/>
+          <w:szCs w:val="28"/>
+        </w:rPr>
+        <w:drawing>
+          <wp:inline distT="0" distB="0" distL="0" distR="0" wp14:anchorId="47B663D3" wp14:editId="3B206168">
+            <wp:extent cx="3101609" cy="1348857"/>
+            <wp:effectExtent l="0" t="0" r="3810" b="3810"/>
+            <wp:docPr id="1893500755" name="Picture 1"/>
+            <wp:cNvGraphicFramePr>
+              <a:graphicFrameLocks xmlns:a="http://schemas.openxmlformats.org/drawingml/2006/main" noChangeAspect="1"/>
+            </wp:cNvGraphicFramePr>
+            <a:graphic xmlns:a="http://schemas.openxmlformats.org/drawingml/2006/main">
+              <a:graphicData uri="http://schemas.openxmlformats.org/drawingml/2006/picture">
+                <pic:pic xmlns:pic="http://schemas.openxmlformats.org/drawingml/2006/picture">
+                  <pic:nvPicPr>
+                    <pic:cNvPr id="1893500755" name=""/>
+                    <pic:cNvPicPr/>
+                  </pic:nvPicPr>
+                  <pic:blipFill>
+                    <a:blip r:embed="rId8"/>
+                    <a:stretch>
+                      <a:fillRect/>
+                    </a:stretch>
+                  </pic:blipFill>
+                  <pic:spPr>
+                    <a:xfrm>
+                      <a:off x="0" y="0"/>
+                      <a:ext cx="3101609" cy="1348857"/>
+                    </a:xfrm>
+                    <a:prstGeom prst="rect">
+                      <a:avLst/>
+                    </a:prstGeom>
+                  </pic:spPr>
+                </pic:pic>
+              </a:graphicData>
+            </a:graphic>
+          </wp:inline>
+        </w:drawing>
+      </w:r>
+    </w:p>
+    <w:p>
+      <w:r>
+        <w:t>To plot the hyper plane on we have to convert the non separable data to separable data by changing it’s dim, kernel function are used here.</w:t>
+      </w:r>
+    </w:p>
+    <w:p/>
+    <w:p>
+      <w:pPr>
+        <w:rPr>
+          <w:b/>
+          <w:bCs/>
+          <w:sz w:val="28"/>
+          <w:szCs w:val="28"/>
+        </w:rPr>
+      </w:pPr>
+      <w:r>
+        <w:rPr>
+          <w:b/>
+          <w:bCs/>
+          <w:sz w:val="28"/>
+          <w:szCs w:val="28"/>
+        </w:rPr>
+        <w:t>KERNEL FUNCTIONS</w:t>
+      </w:r>
+    </w:p>
+    <w:p>
+      <w:r>
+        <w:t xml:space="preserve">We have to find in what dim we should change our data to make </w:t>
+      </w:r>
+      <w:r>
+        <w:t>separable</w:t>
+      </w:r>
+      <w:r>
+        <w:t>, to find the ideal dim kernel functions are used here.</w:t>
+      </w:r>
+    </w:p>
+    <w:p>
+      <w:pPr>
+        <w:pStyle w:val="ListParagraph"/>
         <w:numPr>
           <w:ilvl w:val="0"/>
-          <w:numId w:val="1"/>
+          <w:numId w:val="5"/>
         </w:numPr>
-      </w:pPr>
-      <w:r>
-        <w:rPr>
-          <w:b/>
-          <w:bCs/>
-        </w:rPr>
-        <w:t>Linear kernel</w:t>
-      </w:r>
-      <w:r>
-        <w:t xml:space="preserve"> (for straight line separation),</w:t>
-      </w:r>
-    </w:p>
-    <w:p>
-      <w:pPr>
+        <w:rPr>
+          <w:b/>
+          <w:bCs/>
+        </w:rPr>
+      </w:pPr>
+      <w:r>
+        <w:rPr>
+          <w:b/>
+          <w:bCs/>
+        </w:rPr>
+        <w:t xml:space="preserve">Polynomial kernel function </w:t>
+      </w:r>
+      <w:r>
+        <w:rPr>
+          <w:b/>
+          <w:bCs/>
+        </w:rPr>
+        <w:t xml:space="preserve">– </w:t>
+      </w:r>
+      <w:r>
+        <w:t xml:space="preserve">It tries to fit a polynomial(curved linear line) line to the dataset to make all the data separable, </w:t>
+      </w:r>
+      <w:r>
+        <w:t>Takes argument d which says the dim that are going to be changed</w:t>
+      </w:r>
+      <w:r>
+        <w:t>, it is used with cross validation</w:t>
+      </w:r>
+      <w:r>
+        <w:t>s</w:t>
+      </w:r>
+      <w:r>
+        <w:t xml:space="preserve"> to find the optimal d value</w:t>
+      </w:r>
+    </w:p>
+    <w:p>
+      <w:pPr>
+        <w:pStyle w:val="ListParagraph"/>
+        <w:rPr>
+          <w:b/>
+          <w:bCs/>
+        </w:rPr>
+      </w:pPr>
+    </w:p>
+    <w:p>
+      <w:pPr>
+        <w:pStyle w:val="ListParagraph"/>
         <w:numPr>
           <w:ilvl w:val="0"/>
-          <w:numId w:val="1"/>
+          <w:numId w:val="5"/>
         </w:numPr>
-      </w:pPr>
-      <w:r>
-        <w:rPr>
-          <w:b/>
-          <w:bCs/>
-        </w:rPr>
-        <w:t>Polynomial kernel</w:t>
-      </w:r>
-      <w:r>
-        <w:t xml:space="preserve"> (curvy boundaries),</w:t>
-      </w:r>
-    </w:p>
-    <w:p>
-      <w:pPr>
-        <w:numPr>
-          <w:ilvl w:val="0"/>
-          <w:numId w:val="1"/>
-        </w:numPr>
-      </w:pPr>
-      <w:r>
-        <w:rPr>
-          <w:b/>
-          <w:bCs/>
-        </w:rPr>
-        <w:t>RBF/Gaussian kernel</w:t>
-      </w:r>
-      <w:r>
-        <w:t xml:space="preserve"> (complex shapes for tough cases).</w:t>
-      </w:r>
-    </w:p>
-    <w:p>
-      <w:r>
-        <w:pict w14:anchorId="3902B701">
-          <v:rect id="_x0000_i1037" style="width:0;height:1.5pt" o:hralign="center" o:hrstd="t" o:hr="t" fillcolor="#a0a0a0" stroked="f"/>
-        </w:pict>
-      </w:r>
-    </w:p>
-    <w:p>
-      <w:pPr>
-        <w:rPr>
-          <w:b/>
-          <w:bCs/>
-        </w:rPr>
-      </w:pPr>
-      <w:r>
-        <w:rPr>
-          <w:rFonts w:ascii="Segoe UI Emoji" w:hAnsi="Segoe UI Emoji" w:cs="Segoe UI Emoji"/>
-          <w:b/>
-          <w:bCs/>
-        </w:rPr>
-        <w:t>✅</w:t>
-      </w:r>
-      <w:r>
-        <w:rPr>
-          <w:b/>
-          <w:bCs/>
-        </w:rPr>
-        <w:t xml:space="preserve"> Example:</w:t>
-      </w:r>
-    </w:p>
-    <w:p>
-      <w:r>
-        <w:t>Let's say you're classifying emails into "Spam" and "Not Spam" using features like:</w:t>
-      </w:r>
-    </w:p>
-    <w:p>
-      <w:pPr>
-        <w:numPr>
-          <w:ilvl w:val="0"/>
-          <w:numId w:val="2"/>
-        </w:numPr>
-      </w:pPr>
-      <w:r>
-        <w:t>Number of links</w:t>
-      </w:r>
-    </w:p>
-    <w:p>
-      <w:pPr>
-        <w:numPr>
-          <w:ilvl w:val="0"/>
-          <w:numId w:val="2"/>
-        </w:numPr>
-      </w:pPr>
-      <w:r>
-        <w:t>Number of capital letters</w:t>
-      </w:r>
-    </w:p>
-    <w:p>
-      <w:pPr>
-        <w:numPr>
-          <w:ilvl w:val="0"/>
-          <w:numId w:val="2"/>
-        </w:numPr>
-      </w:pPr>
-      <w:r>
-        <w:t>Frequency of certain words</w:t>
-      </w:r>
-    </w:p>
-    <w:p>
-      <w:r>
-        <w:t xml:space="preserve">If simple rules can't separate them, SVM uses a </w:t>
-      </w:r>
-      <w:r>
-        <w:rPr>
-          <w:b/>
-          <w:bCs/>
-        </w:rPr>
-        <w:t>kernel trick</w:t>
-      </w:r>
-      <w:r>
-        <w:t xml:space="preserve"> to map these features into a higher dimension so it can find a </w:t>
-      </w:r>
-      <w:r>
-        <w:rPr>
-          <w:b/>
-          <w:bCs/>
-        </w:rPr>
-        <w:t>boundary (hyperplane)</w:t>
-      </w:r>
-      <w:r>
-        <w:t xml:space="preserve"> that cleanly splits spam from non-spam.</w:t>
-      </w:r>
-    </w:p>
-    <w:p>
-      <w:r>
-        <w:pict w14:anchorId="38336493">
-          <v:rect id="_x0000_i1038" style="width:0;height:1.5pt" o:hralign="center" o:hrstd="t" o:hr="t" fillcolor="#a0a0a0" stroked="f"/>
-        </w:pict>
-      </w:r>
-    </w:p>
-    <w:p>
-      <w:pPr>
-        <w:rPr>
-          <w:b/>
-          <w:bCs/>
-        </w:rPr>
-      </w:pPr>
-      <w:r>
-        <w:rPr>
-          <w:rFonts w:ascii="Segoe UI Emoji" w:hAnsi="Segoe UI Emoji" w:cs="Segoe UI Emoji"/>
-          <w:b/>
-          <w:bCs/>
-        </w:rPr>
-        <w:t>📌</w:t>
-      </w:r>
-      <w:r>
-        <w:rPr>
-          <w:b/>
-          <w:bCs/>
-        </w:rPr>
-        <w:t xml:space="preserve"> Key Point:</w:t>
-      </w:r>
-    </w:p>
-    <w:p>
-      <w:r>
-        <w:t>SVM is powerful because it:</w:t>
-      </w:r>
-    </w:p>
-    <w:p>
-      <w:pPr>
-        <w:numPr>
-          <w:ilvl w:val="0"/>
-          <w:numId w:val="3"/>
-        </w:numPr>
-      </w:pPr>
-      <w:r>
-        <w:t>Finds the best margin between classes,</w:t>
-      </w:r>
-    </w:p>
-    <w:p>
-      <w:pPr>
-        <w:numPr>
-          <w:ilvl w:val="0"/>
-          <w:numId w:val="3"/>
-        </w:numPr>
-      </w:pPr>
-      <w:r>
-        <w:t>Works for both linear and non-linear data,</w:t>
-      </w:r>
-    </w:p>
-    <w:p>
-      <w:pPr>
-        <w:numPr>
-          <w:ilvl w:val="0"/>
-          <w:numId w:val="3"/>
-        </w:numPr>
-      </w:pPr>
-      <w:r>
-        <w:t>Uses kernel functions to handle complex boundaries.</w:t>
-      </w:r>
+        <w:rPr>
+          <w:b/>
+          <w:bCs/>
+        </w:rPr>
+      </w:pPr>
+      <w:r>
+        <w:rPr>
+          <w:b/>
+          <w:bCs/>
+        </w:rPr>
+        <w:t xml:space="preserve">Radial kernel function – </w:t>
+      </w:r>
+      <w:r>
+        <w:t>This automatically chooses a dim to make all the data separable</w:t>
+      </w:r>
+      <w:r>
+        <w:t>, it doesn’t take d argument</w:t>
+      </w:r>
+    </w:p>
+    <w:p/>
+    <w:p>
+      <w:pPr>
+        <w:ind w:left="360"/>
+      </w:pPr>
     </w:p>
     <w:p/>
     <w:sectPr>
@@ -355,6 +521,184 @@
 <file path=word/numbering.xml><?xml version="1.0" encoding="utf-8"?>
 <w:numbering xmlns:wpc="http://schemas.microsoft.com/office/word/2010/wordprocessingCanvas" xmlns:cx="http://schemas.microsoft.com/office/drawing/2014/chartex" xmlns:cx1="http://schemas.microsoft.com/office/drawing/2015/9/8/chartex" xmlns:cx2="http://schemas.microsoft.com/office/drawing/2015/10/21/chartex" xmlns:cx3="http://schemas.microsoft.com/office/drawing/2016/5/9/chartex" xmlns:cx4="http://schemas.microsoft.com/office/drawing/2016/5/10/chartex" xmlns:cx5="http://schemas.microsoft.com/office/drawing/2016/5/11/chartex" xmlns:cx6="http://schemas.microsoft.com/office/drawing/2016/5/12/chartex" xmlns:cx7="http://schemas.microsoft.com/office/drawing/2016/5/13/chartex" xmlns:cx8="http://schemas.microsoft.com/office/drawing/2016/5/14/chartex" xmlns:mc="http://schemas.openxmlformats.org/markup-compatibility/2006" xmlns:aink="http://schemas.microsoft.com/office/drawing/2016/ink" xmlns:am3d="http://schemas.microsoft.com/office/drawing/2017/model3d" xmlns:o="urn:schemas-microsoft-com:office:office" xmlns:oel="http://schemas.microsoft.com/office/2019/extlst" xmlns:r="http://schemas.openxmlformats.org/officeDocument/2006/relationships" xmlns:m="http://schemas.openxmlformats.org/officeDocument/2006/math" xmlns:v="urn:schemas-microsoft-com:vml" xmlns:wp14="http://schemas.microsoft.com/office/word/2010/wordprocessingDrawing" xmlns:wp="http://schemas.openxmlformats.org/drawingml/2006/wordprocessingDrawing" xmlns:w10="urn:schemas-microsoft-com:office:word" xmlns:w="http://schemas.openxmlformats.org/wordprocessingml/2006/main" xmlns:w14="http://schemas.microsoft.com/office/word/2010/wordml" xmlns:w15="http://schemas.microsoft.com/office/word/2012/wordml" xmlns:w16cex="http://schemas.microsoft.com/office/word/2018/wordml/cex" xmlns:w16cid="http://schemas.microsoft.com/office/word/2016/wordml/cid" xmlns:w16="http://schemas.microsoft.com/office/word/2018/wordml" xmlns:w16du="http://schemas.microsoft.com/office/word/2023/wordml/word16du" xmlns:w16sdtdh="http://schemas.microsoft.com/office/word/2020/wordml/sdtdatahash" xmlns:w16sdtfl="http://schemas.microsoft.com/office/word/2024/wordml/sdtformatlock" xmlns:w16se="http://schemas.microsoft.com/office/word/2015/wordml/symex" xmlns:wpg="http://schemas.microsoft.com/office/word/2010/wordprocessingGroup" xmlns:wpi="http://schemas.microsoft.com/office/word/2010/wordprocessingInk" xmlns:wne="http://schemas.microsoft.com/office/word/2006/wordml" xmlns:wps="http://schemas.microsoft.com/office/word/2010/wordprocessingShape" mc:Ignorable="w14 w15 w16se w16cid w16 w16cex w16sdtdh w16sdtfl w16du wp14">
   <w:abstractNum w:abstractNumId="0" w15:restartNumberingAfterBreak="0">
+    <w:nsid w:val="53A364D5"/>
+    <w:multiLevelType w:val="hybridMultilevel"/>
+    <w:tmpl w:val="6FF46BFC"/>
+    <w:lvl w:ilvl="0" w:tplc="4009000F">
+      <w:start w:val="1"/>
+      <w:numFmt w:val="decimal"/>
+      <w:lvlText w:val="%1."/>
+      <w:lvlJc w:val="left"/>
+      <w:pPr>
+        <w:ind w:left="720" w:hanging="360"/>
+      </w:pPr>
+      <w:rPr>
+        <w:rFonts w:hint="default"/>
+      </w:rPr>
+    </w:lvl>
+    <w:lvl w:ilvl="1" w:tplc="40090019" w:tentative="1">
+      <w:start w:val="1"/>
+      <w:numFmt w:val="lowerLetter"/>
+      <w:lvlText w:val="%2."/>
+      <w:lvlJc w:val="left"/>
+      <w:pPr>
+        <w:ind w:left="1440" w:hanging="360"/>
+      </w:pPr>
+    </w:lvl>
+    <w:lvl w:ilvl="2" w:tplc="4009001B" w:tentative="1">
+      <w:start w:val="1"/>
+      <w:numFmt w:val="lowerRoman"/>
+      <w:lvlText w:val="%3."/>
+      <w:lvlJc w:val="right"/>
+      <w:pPr>
+        <w:ind w:left="2160" w:hanging="180"/>
+      </w:pPr>
+    </w:lvl>
+    <w:lvl w:ilvl="3" w:tplc="4009000F" w:tentative="1">
+      <w:start w:val="1"/>
+      <w:numFmt w:val="decimal"/>
+      <w:lvlText w:val="%4."/>
+      <w:lvlJc w:val="left"/>
+      <w:pPr>
+        <w:ind w:left="2880" w:hanging="360"/>
+      </w:pPr>
+    </w:lvl>
+    <w:lvl w:ilvl="4" w:tplc="40090019" w:tentative="1">
+      <w:start w:val="1"/>
+      <w:numFmt w:val="lowerLetter"/>
+      <w:lvlText w:val="%5."/>
+      <w:lvlJc w:val="left"/>
+      <w:pPr>
+        <w:ind w:left="3600" w:hanging="360"/>
+      </w:pPr>
+    </w:lvl>
+    <w:lvl w:ilvl="5" w:tplc="4009001B" w:tentative="1">
+      <w:start w:val="1"/>
+      <w:numFmt w:val="lowerRoman"/>
+      <w:lvlText w:val="%6."/>
+      <w:lvlJc w:val="right"/>
+      <w:pPr>
+        <w:ind w:left="4320" w:hanging="180"/>
+      </w:pPr>
+    </w:lvl>
+    <w:lvl w:ilvl="6" w:tplc="4009000F" w:tentative="1">
+      <w:start w:val="1"/>
+      <w:numFmt w:val="decimal"/>
+      <w:lvlText w:val="%7."/>
+      <w:lvlJc w:val="left"/>
+      <w:pPr>
+        <w:ind w:left="5040" w:hanging="360"/>
+      </w:pPr>
+    </w:lvl>
+    <w:lvl w:ilvl="7" w:tplc="40090019" w:tentative="1">
+      <w:start w:val="1"/>
+      <w:numFmt w:val="lowerLetter"/>
+      <w:lvlText w:val="%8."/>
+      <w:lvlJc w:val="left"/>
+      <w:pPr>
+        <w:ind w:left="5760" w:hanging="360"/>
+      </w:pPr>
+    </w:lvl>
+    <w:lvl w:ilvl="8" w:tplc="4009001B" w:tentative="1">
+      <w:start w:val="1"/>
+      <w:numFmt w:val="lowerRoman"/>
+      <w:lvlText w:val="%9."/>
+      <w:lvlJc w:val="right"/>
+      <w:pPr>
+        <w:ind w:left="6480" w:hanging="180"/>
+      </w:pPr>
+    </w:lvl>
+  </w:abstractNum>
+  <w:abstractNum w:abstractNumId="1" w15:restartNumberingAfterBreak="0">
+    <w:nsid w:val="598C0C95"/>
+    <w:multiLevelType w:val="hybridMultilevel"/>
+    <w:tmpl w:val="8DC68E8C"/>
+    <w:lvl w:ilvl="0" w:tplc="4009000F">
+      <w:start w:val="1"/>
+      <w:numFmt w:val="decimal"/>
+      <w:lvlText w:val="%1."/>
+      <w:lvlJc w:val="left"/>
+      <w:pPr>
+        <w:ind w:left="720" w:hanging="360"/>
+      </w:pPr>
+      <w:rPr>
+        <w:rFonts w:hint="default"/>
+      </w:rPr>
+    </w:lvl>
+    <w:lvl w:ilvl="1" w:tplc="40090019" w:tentative="1">
+      <w:start w:val="1"/>
+      <w:numFmt w:val="lowerLetter"/>
+      <w:lvlText w:val="%2."/>
+      <w:lvlJc w:val="left"/>
+      <w:pPr>
+        <w:ind w:left="1440" w:hanging="360"/>
+      </w:pPr>
+    </w:lvl>
+    <w:lvl w:ilvl="2" w:tplc="4009001B" w:tentative="1">
+      <w:start w:val="1"/>
+      <w:numFmt w:val="lowerRoman"/>
+      <w:lvlText w:val="%3."/>
+      <w:lvlJc w:val="right"/>
+      <w:pPr>
+        <w:ind w:left="2160" w:hanging="180"/>
+      </w:pPr>
+    </w:lvl>
+    <w:lvl w:ilvl="3" w:tplc="4009000F" w:tentative="1">
+      <w:start w:val="1"/>
+      <w:numFmt w:val="decimal"/>
+      <w:lvlText w:val="%4."/>
+      <w:lvlJc w:val="left"/>
+      <w:pPr>
+        <w:ind w:left="2880" w:hanging="360"/>
+      </w:pPr>
+    </w:lvl>
+    <w:lvl w:ilvl="4" w:tplc="40090019" w:tentative="1">
+      <w:start w:val="1"/>
+      <w:numFmt w:val="lowerLetter"/>
+      <w:lvlText w:val="%5."/>
+      <w:lvlJc w:val="left"/>
+      <w:pPr>
+        <w:ind w:left="3600" w:hanging="360"/>
+      </w:pPr>
+    </w:lvl>
+    <w:lvl w:ilvl="5" w:tplc="4009001B" w:tentative="1">
+      <w:start w:val="1"/>
+      <w:numFmt w:val="lowerRoman"/>
+      <w:lvlText w:val="%6."/>
+      <w:lvlJc w:val="right"/>
+      <w:pPr>
+        <w:ind w:left="4320" w:hanging="180"/>
+      </w:pPr>
+    </w:lvl>
+    <w:lvl w:ilvl="6" w:tplc="4009000F" w:tentative="1">
+      <w:start w:val="1"/>
+      <w:numFmt w:val="decimal"/>
+      <w:lvlText w:val="%7."/>
+      <w:lvlJc w:val="left"/>
+      <w:pPr>
+        <w:ind w:left="5040" w:hanging="360"/>
+      </w:pPr>
+    </w:lvl>
+    <w:lvl w:ilvl="7" w:tplc="40090019" w:tentative="1">
+      <w:start w:val="1"/>
+      <w:numFmt w:val="lowerLetter"/>
+      <w:lvlText w:val="%8."/>
+      <w:lvlJc w:val="left"/>
+      <w:pPr>
+        <w:ind w:left="5760" w:hanging="360"/>
+      </w:pPr>
+    </w:lvl>
+    <w:lvl w:ilvl="8" w:tplc="4009001B" w:tentative="1">
+      <w:start w:val="1"/>
+      <w:numFmt w:val="lowerRoman"/>
+      <w:lvlText w:val="%9."/>
+      <w:lvlJc w:val="right"/>
+      <w:pPr>
+        <w:ind w:left="6480" w:hanging="180"/>
+      </w:pPr>
+    </w:lvl>
+  </w:abstractNum>
+  <w:abstractNum w:abstractNumId="2" w15:restartNumberingAfterBreak="0">
     <w:nsid w:val="5FD118DE"/>
     <w:multiLevelType w:val="multilevel"/>
     <w:tmpl w:val="5A06EFA6"/>
@@ -503,7 +847,7 @@
       </w:rPr>
     </w:lvl>
   </w:abstractNum>
-  <w:abstractNum w:abstractNumId="1" w15:restartNumberingAfterBreak="0">
+  <w:abstractNum w:abstractNumId="3" w15:restartNumberingAfterBreak="0">
     <w:nsid w:val="6D5D4ABA"/>
     <w:multiLevelType w:val="multilevel"/>
     <w:tmpl w:val="07C800D6"/>
@@ -652,7 +996,7 @@
       </w:rPr>
     </w:lvl>
   </w:abstractNum>
-  <w:abstractNum w:abstractNumId="2" w15:restartNumberingAfterBreak="0">
+  <w:abstractNum w:abstractNumId="4" w15:restartNumberingAfterBreak="0">
     <w:nsid w:val="77A60076"/>
     <w:multiLevelType w:val="multilevel"/>
     <w:tmpl w:val="CC0C8128"/>
@@ -802,12 +1146,18 @@
     </w:lvl>
   </w:abstractNum>
   <w:num w:numId="1" w16cid:durableId="1138688336">
+    <w:abstractNumId w:val="3"/>
+  </w:num>
+  <w:num w:numId="2" w16cid:durableId="698942859">
+    <w:abstractNumId w:val="4"/>
+  </w:num>
+  <w:num w:numId="3" w16cid:durableId="426193433">
+    <w:abstractNumId w:val="2"/>
+  </w:num>
+  <w:num w:numId="4" w16cid:durableId="52894155">
     <w:abstractNumId w:val="1"/>
   </w:num>
-  <w:num w:numId="2" w16cid:durableId="698942859">
-    <w:abstractNumId w:val="2"/>
-  </w:num>
-  <w:num w:numId="3" w16cid:durableId="426193433">
+  <w:num w:numId="5" w16cid:durableId="214005091">
     <w:abstractNumId w:val="0"/>
   </w:num>
 </w:numbering>

</xml_diff>